<commit_message>
docs(entregas): aponta geradores de docs para Entregas/Teams + ajusta metadados
Atualiza os caminhos de saída das definições (.mjs) de
Entregas/Sprint N/... para Entregas/Teams/Tarefas/... e os relatórios
finais para Entregas/Teams/Relatorios/..., alinhando com a reorganização
Teams vs Nao-Teams. Corrige metadados (status Concluído, responsáveis,
datas) e regenera os .docx correspondentes. Remove duplicata antiga de
S2T24 sem o sufixo IMPLEMENTADO.

Co-Authored-By: Claude Fable 5 <noreply@anthropic.com>
</commit_message>
<xml_diff>
--- a/Entregas/Teams/Tarefas/Sprint 2/Integração Google Drive/H6 - Implementar exportação para Google Drive/PSP2 - S2T27 - OAuth2 Google Drive.docx
+++ b/Entregas/Teams/Tarefas/Sprint 2/Integração Google Drive/H6 - Implementar exportação para Google Drive/PSP2 - S2T27 - OAuth2 Google Drive.docx
@@ -442,7 +442,7 @@
                 <w:sz w:val="20"/>
                 <w:szCs w:val="20"/>
               </w:rPr>
-              <w:t xml:space="preserve">Isaac (código) + Theo (config GCP)</w:t>
+              <w:t xml:space="preserve">Isaac</w:t>
             </w:r>
           </w:p>
         </w:tc>
@@ -566,7 +566,7 @@
                 <w:sz w:val="20"/>
                 <w:szCs w:val="20"/>
               </w:rPr>
-              <w:t xml:space="preserve">14/05/2026</w:t>
+              <w:t xml:space="preserve">04/05/2026</w:t>
             </w:r>
           </w:p>
         </w:tc>
@@ -628,7 +628,7 @@
                 <w:sz w:val="20"/>
                 <w:szCs w:val="20"/>
               </w:rPr>
-              <w:t xml:space="preserve">26/05/2026</w:t>
+              <w:t xml:space="preserve">23/05/2026</w:t>
             </w:r>
           </w:p>
         </w:tc>
@@ -690,7 +690,7 @@
                 <w:sz w:val="20"/>
                 <w:szCs w:val="20"/>
               </w:rPr>
-              <w:t xml:space="preserve">Código concluído — aguarda config GCP</w:t>
+              <w:t xml:space="preserve">Concluído</w:t>
             </w:r>
           </w:p>
         </w:tc>

</xml_diff>